<commit_message>
prueba de buzon de sugerencias
se añade la funcionalidad de el buzon de sugerencias y reclamos, en esta los usuarios pueden poner reclamos y sugerencias a administracion para tener trazabilidad de estos
</commit_message>
<xml_diff>
--- a/manual de uso/Manual de uso general.docx
+++ b/manual de uso/Manual de uso general.docx
@@ -13,8 +13,13 @@
         <w:t xml:space="preserve">general </w:t>
       </w:r>
       <w:r>
-        <w:t>para sistema de inventario y generación de planillas Berfre</w:t>
-      </w:r>
+        <w:t xml:space="preserve">para sistema de inventario y generación de planillas </w:t>
+      </w:r>
+      <w:proofErr w:type="spellStart"/>
+      <w:r>
+        <w:t>Berfre</w:t>
+      </w:r>
+      <w:proofErr w:type="spellEnd"/>
     </w:p>
     <w:p>
       <w:pPr>
@@ -89,7 +94,7 @@
           <w:r>
             <w:fldChar w:fldCharType="separate"/>
           </w:r>
-          <w:hyperlink w:anchor="_Toc243292428" w:history="1">
+          <w:hyperlink w:anchor="_Toc243984708" w:history="1">
             <w:r>
               <w:rPr>
                 <w:rStyle w:val="Hipervnculo"/>
@@ -118,7 +123,7 @@
                 <w:noProof/>
                 <w:webHidden/>
               </w:rPr>
-              <w:instrText xml:space="preserve"> PAGEREF _Toc243292428 \h </w:instrText>
+              <w:instrText xml:space="preserve"> PAGEREF _Toc243984708 \h </w:instrText>
             </w:r>
             <w:r>
               <w:rPr>
@@ -161,7 +166,7 @@
               <w:lang w:eastAsia="es-CL"/>
             </w:rPr>
           </w:pPr>
-          <w:hyperlink w:anchor="_Toc243292429" w:history="1">
+          <w:hyperlink w:anchor="_Toc243984709" w:history="1">
             <w:r>
               <w:rPr>
                 <w:rStyle w:val="Hipervnculo"/>
@@ -190,7 +195,7 @@
                 <w:noProof/>
                 <w:webHidden/>
               </w:rPr>
-              <w:instrText xml:space="preserve"> PAGEREF _Toc243292429 \h </w:instrText>
+              <w:instrText xml:space="preserve"> PAGEREF _Toc243984709 \h </w:instrText>
             </w:r>
             <w:r>
               <w:rPr>
@@ -233,7 +238,7 @@
               <w:lang w:eastAsia="es-CL"/>
             </w:rPr>
           </w:pPr>
-          <w:hyperlink w:anchor="_Toc243292430" w:history="1">
+          <w:hyperlink w:anchor="_Toc243984710" w:history="1">
             <w:r>
               <w:rPr>
                 <w:rStyle w:val="Hipervnculo"/>
@@ -262,7 +267,7 @@
                 <w:noProof/>
                 <w:webHidden/>
               </w:rPr>
-              <w:instrText xml:space="preserve"> PAGEREF _Toc243292430 \h </w:instrText>
+              <w:instrText xml:space="preserve"> PAGEREF _Toc243984710 \h </w:instrText>
             </w:r>
             <w:r>
               <w:rPr>
@@ -305,7 +310,7 @@
               <w:lang w:eastAsia="es-CL"/>
             </w:rPr>
           </w:pPr>
-          <w:hyperlink w:anchor="_Toc243292431" w:history="1">
+          <w:hyperlink w:anchor="_Toc243984711" w:history="1">
             <w:r>
               <w:rPr>
                 <w:rStyle w:val="Hipervnculo"/>
@@ -334,7 +339,7 @@
                 <w:noProof/>
                 <w:webHidden/>
               </w:rPr>
-              <w:instrText xml:space="preserve"> PAGEREF _Toc243292431 \h </w:instrText>
+              <w:instrText xml:space="preserve"> PAGEREF _Toc243984711 \h </w:instrText>
             </w:r>
             <w:r>
               <w:rPr>
@@ -377,7 +382,7 @@
               <w:lang w:eastAsia="es-CL"/>
             </w:rPr>
           </w:pPr>
-          <w:hyperlink w:anchor="_Toc243292432" w:history="1">
+          <w:hyperlink w:anchor="_Toc243984712" w:history="1">
             <w:r>
               <w:rPr>
                 <w:rStyle w:val="Hipervnculo"/>
@@ -406,7 +411,7 @@
                 <w:noProof/>
                 <w:webHidden/>
               </w:rPr>
-              <w:instrText xml:space="preserve"> PAGEREF _Toc243292432 \h </w:instrText>
+              <w:instrText xml:space="preserve"> PAGEREF _Toc243984712 \h </w:instrText>
             </w:r>
             <w:r>
               <w:rPr>
@@ -449,7 +454,7 @@
               <w:lang w:eastAsia="es-CL"/>
             </w:rPr>
           </w:pPr>
-          <w:hyperlink w:anchor="_Toc243292433" w:history="1">
+          <w:hyperlink w:anchor="_Toc243984713" w:history="1">
             <w:r>
               <w:rPr>
                 <w:rStyle w:val="Hipervnculo"/>
@@ -478,7 +483,7 @@
                 <w:noProof/>
                 <w:webHidden/>
               </w:rPr>
-              <w:instrText xml:space="preserve"> PAGEREF _Toc243292433 \h </w:instrText>
+              <w:instrText xml:space="preserve"> PAGEREF _Toc243984713 \h </w:instrText>
             </w:r>
             <w:r>
               <w:rPr>
@@ -521,7 +526,7 @@
               <w:lang w:eastAsia="es-CL"/>
             </w:rPr>
           </w:pPr>
-          <w:hyperlink w:anchor="_Toc243292434" w:history="1">
+          <w:hyperlink w:anchor="_Toc243984714" w:history="1">
             <w:r>
               <w:rPr>
                 <w:rStyle w:val="Hipervnculo"/>
@@ -550,7 +555,7 @@
                 <w:noProof/>
                 <w:webHidden/>
               </w:rPr>
-              <w:instrText xml:space="preserve"> PAGEREF _Toc243292434 \h </w:instrText>
+              <w:instrText xml:space="preserve"> PAGEREF _Toc243984714 \h </w:instrText>
             </w:r>
             <w:r>
               <w:rPr>
@@ -593,7 +598,7 @@
               <w:lang w:eastAsia="es-CL"/>
             </w:rPr>
           </w:pPr>
-          <w:hyperlink w:anchor="_Toc243292435" w:history="1">
+          <w:hyperlink w:anchor="_Toc243984715" w:history="1">
             <w:r>
               <w:rPr>
                 <w:rStyle w:val="Hipervnculo"/>
@@ -622,7 +627,7 @@
                 <w:noProof/>
                 <w:webHidden/>
               </w:rPr>
-              <w:instrText xml:space="preserve"> PAGEREF _Toc243292435 \h </w:instrText>
+              <w:instrText xml:space="preserve"> PAGEREF _Toc243984715 \h </w:instrText>
             </w:r>
             <w:r>
               <w:rPr>
@@ -665,7 +670,7 @@
               <w:lang w:eastAsia="es-CL"/>
             </w:rPr>
           </w:pPr>
-          <w:hyperlink w:anchor="_Toc243292436" w:history="1">
+          <w:hyperlink w:anchor="_Toc243984716" w:history="1">
             <w:r>
               <w:rPr>
                 <w:rStyle w:val="Hipervnculo"/>
@@ -694,7 +699,7 @@
                 <w:noProof/>
                 <w:webHidden/>
               </w:rPr>
-              <w:instrText xml:space="preserve"> PAGEREF _Toc243292436 \h </w:instrText>
+              <w:instrText xml:space="preserve"> PAGEREF _Toc243984716 \h </w:instrText>
             </w:r>
             <w:r>
               <w:rPr>
@@ -737,7 +742,7 @@
               <w:lang w:eastAsia="es-CL"/>
             </w:rPr>
           </w:pPr>
-          <w:hyperlink w:anchor="_Toc243292437" w:history="1">
+          <w:hyperlink w:anchor="_Toc243984717" w:history="1">
             <w:r>
               <w:rPr>
                 <w:rStyle w:val="Hipervnculo"/>
@@ -766,7 +771,7 @@
                 <w:noProof/>
                 <w:webHidden/>
               </w:rPr>
-              <w:instrText xml:space="preserve"> PAGEREF _Toc243292437 \h </w:instrText>
+              <w:instrText xml:space="preserve"> PAGEREF _Toc243984717 \h </w:instrText>
             </w:r>
             <w:r>
               <w:rPr>
@@ -809,7 +814,7 @@
               <w:lang w:eastAsia="es-CL"/>
             </w:rPr>
           </w:pPr>
-          <w:hyperlink w:anchor="_Toc243292438" w:history="1">
+          <w:hyperlink w:anchor="_Toc243984718" w:history="1">
             <w:r>
               <w:rPr>
                 <w:rStyle w:val="Hipervnculo"/>
@@ -838,7 +843,7 @@
                 <w:noProof/>
                 <w:webHidden/>
               </w:rPr>
-              <w:instrText xml:space="preserve"> PAGEREF _Toc243292438 \h </w:instrText>
+              <w:instrText xml:space="preserve"> PAGEREF _Toc243984718 \h </w:instrText>
             </w:r>
             <w:r>
               <w:rPr>
@@ -881,7 +886,7 @@
               <w:lang w:eastAsia="es-CL"/>
             </w:rPr>
           </w:pPr>
-          <w:hyperlink w:anchor="_Toc243292439" w:history="1">
+          <w:hyperlink w:anchor="_Toc243984719" w:history="1">
             <w:r>
               <w:rPr>
                 <w:rStyle w:val="Hipervnculo"/>
@@ -910,7 +915,7 @@
                 <w:noProof/>
                 <w:webHidden/>
               </w:rPr>
-              <w:instrText xml:space="preserve"> PAGEREF _Toc243292439 \h </w:instrText>
+              <w:instrText xml:space="preserve"> PAGEREF _Toc243984719 \h </w:instrText>
             </w:r>
             <w:r>
               <w:rPr>
@@ -953,7 +958,7 @@
               <w:lang w:eastAsia="es-CL"/>
             </w:rPr>
           </w:pPr>
-          <w:hyperlink w:anchor="_Toc243292440" w:history="1">
+          <w:hyperlink w:anchor="_Toc243984720" w:history="1">
             <w:r>
               <w:rPr>
                 <w:rStyle w:val="Hipervnculo"/>
@@ -961,7 +966,7 @@
                 <w:bCs/>
                 <w:noProof/>
               </w:rPr>
-              <w:t>Cargar QR</w:t>
+              <w:t>Movimientos</w:t>
             </w:r>
             <w:r>
               <w:rPr>
@@ -982,7 +987,7 @@
                 <w:noProof/>
                 <w:webHidden/>
               </w:rPr>
-              <w:instrText xml:space="preserve"> PAGEREF _Toc243292440 \h </w:instrText>
+              <w:instrText xml:space="preserve"> PAGEREF _Toc243984720 \h </w:instrText>
             </w:r>
             <w:r>
               <w:rPr>
@@ -1025,7 +1030,7 @@
               <w:lang w:eastAsia="es-CL"/>
             </w:rPr>
           </w:pPr>
-          <w:hyperlink w:anchor="_Toc243292441" w:history="1">
+          <w:hyperlink w:anchor="_Toc243984721" w:history="1">
             <w:r>
               <w:rPr>
                 <w:rStyle w:val="Hipervnculo"/>
@@ -1033,7 +1038,7 @@
                 <w:bCs/>
                 <w:noProof/>
               </w:rPr>
-              <w:t>Cargar rombo</w:t>
+              <w:t>Cargar QR</w:t>
             </w:r>
             <w:r>
               <w:rPr>
@@ -1054,7 +1059,7 @@
                 <w:noProof/>
                 <w:webHidden/>
               </w:rPr>
-              <w:instrText xml:space="preserve"> PAGEREF _Toc243292441 \h </w:instrText>
+              <w:instrText xml:space="preserve"> PAGEREF _Toc243984721 \h </w:instrText>
             </w:r>
             <w:r>
               <w:rPr>
@@ -1097,7 +1102,7 @@
               <w:lang w:eastAsia="es-CL"/>
             </w:rPr>
           </w:pPr>
-          <w:hyperlink w:anchor="_Toc243292442" w:history="1">
+          <w:hyperlink w:anchor="_Toc243984722" w:history="1">
             <w:r>
               <w:rPr>
                 <w:rStyle w:val="Hipervnculo"/>
@@ -1105,6 +1110,78 @@
                 <w:bCs/>
                 <w:noProof/>
               </w:rPr>
+              <w:t>Cargar rombo</w:t>
+            </w:r>
+            <w:r>
+              <w:rPr>
+                <w:noProof/>
+                <w:webHidden/>
+              </w:rPr>
+              <w:tab/>
+            </w:r>
+            <w:r>
+              <w:rPr>
+                <w:noProof/>
+                <w:webHidden/>
+              </w:rPr>
+              <w:fldChar w:fldCharType="begin"/>
+            </w:r>
+            <w:r>
+              <w:rPr>
+                <w:noProof/>
+                <w:webHidden/>
+              </w:rPr>
+              <w:instrText xml:space="preserve"> PAGEREF _Toc243984722 \h </w:instrText>
+            </w:r>
+            <w:r>
+              <w:rPr>
+                <w:noProof/>
+                <w:webHidden/>
+              </w:rPr>
+            </w:r>
+            <w:r>
+              <w:rPr>
+                <w:noProof/>
+                <w:webHidden/>
+              </w:rPr>
+              <w:fldChar w:fldCharType="separate"/>
+            </w:r>
+            <w:r>
+              <w:rPr>
+                <w:noProof/>
+                <w:webHidden/>
+              </w:rPr>
+              <w:t>7</w:t>
+            </w:r>
+            <w:r>
+              <w:rPr>
+                <w:noProof/>
+                <w:webHidden/>
+              </w:rPr>
+              <w:fldChar w:fldCharType="end"/>
+            </w:r>
+          </w:hyperlink>
+        </w:p>
+        <w:p>
+          <w:pPr>
+            <w:pStyle w:val="TDC3"/>
+            <w:tabs>
+              <w:tab w:val="right" w:leader="dot" w:pos="8828"/>
+            </w:tabs>
+            <w:rPr>
+              <w:rFonts w:eastAsiaTheme="minorEastAsia"/>
+              <w:noProof/>
+              <w:lang w:eastAsia="es-CL"/>
+            </w:rPr>
+          </w:pPr>
+          <w:hyperlink w:anchor="_Toc243984723" w:history="1">
+            <w:r>
+              <w:rPr>
+                <w:rStyle w:val="Hipervnculo"/>
+                <w:b/>
+                <w:bCs/>
+                <w:noProof/>
+              </w:rPr>
               <w:t>Cargar fotos</w:t>
             </w:r>
             <w:r>
@@ -1126,7 +1203,7 @@
                 <w:noProof/>
                 <w:webHidden/>
               </w:rPr>
-              <w:instrText xml:space="preserve"> PAGEREF _Toc243292442 \h </w:instrText>
+              <w:instrText xml:space="preserve"> PAGEREF _Toc243984723 \h </w:instrText>
             </w:r>
             <w:r>
               <w:rPr>
@@ -1169,7 +1246,7 @@
               <w:lang w:eastAsia="es-CL"/>
             </w:rPr>
           </w:pPr>
-          <w:hyperlink w:anchor="_Toc243292443" w:history="1">
+          <w:hyperlink w:anchor="_Toc243984724" w:history="1">
             <w:r>
               <w:rPr>
                 <w:rStyle w:val="Hipervnculo"/>
@@ -1177,7 +1254,7 @@
                 <w:bCs/>
                 <w:noProof/>
               </w:rPr>
-              <w:t>Bitácora de camiones</w:t>
+              <w:t>Revisar stock de reserva</w:t>
             </w:r>
             <w:r>
               <w:rPr>
@@ -1198,7 +1275,7 @@
                 <w:noProof/>
                 <w:webHidden/>
               </w:rPr>
-              <w:instrText xml:space="preserve"> PAGEREF _Toc243292443 \h </w:instrText>
+              <w:instrText xml:space="preserve"> PAGEREF _Toc243984724 \h </w:instrText>
             </w:r>
             <w:r>
               <w:rPr>
@@ -1219,6 +1296,150 @@
                 <w:webHidden/>
               </w:rPr>
               <w:t>7</w:t>
+            </w:r>
+            <w:r>
+              <w:rPr>
+                <w:noProof/>
+                <w:webHidden/>
+              </w:rPr>
+              <w:fldChar w:fldCharType="end"/>
+            </w:r>
+          </w:hyperlink>
+        </w:p>
+        <w:p>
+          <w:pPr>
+            <w:pStyle w:val="TDC3"/>
+            <w:tabs>
+              <w:tab w:val="right" w:leader="dot" w:pos="8828"/>
+            </w:tabs>
+            <w:rPr>
+              <w:rFonts w:eastAsiaTheme="minorEastAsia"/>
+              <w:noProof/>
+              <w:lang w:eastAsia="es-CL"/>
+            </w:rPr>
+          </w:pPr>
+          <w:hyperlink w:anchor="_Toc243984725" w:history="1">
+            <w:r>
+              <w:rPr>
+                <w:rStyle w:val="Hipervnculo"/>
+                <w:b/>
+                <w:bCs/>
+                <w:noProof/>
+              </w:rPr>
+              <w:t>Buscar reserva</w:t>
+            </w:r>
+            <w:r>
+              <w:rPr>
+                <w:noProof/>
+                <w:webHidden/>
+              </w:rPr>
+              <w:tab/>
+            </w:r>
+            <w:r>
+              <w:rPr>
+                <w:noProof/>
+                <w:webHidden/>
+              </w:rPr>
+              <w:fldChar w:fldCharType="begin"/>
+            </w:r>
+            <w:r>
+              <w:rPr>
+                <w:noProof/>
+                <w:webHidden/>
+              </w:rPr>
+              <w:instrText xml:space="preserve"> PAGEREF _Toc243984725 \h </w:instrText>
+            </w:r>
+            <w:r>
+              <w:rPr>
+                <w:noProof/>
+                <w:webHidden/>
+              </w:rPr>
+            </w:r>
+            <w:r>
+              <w:rPr>
+                <w:noProof/>
+                <w:webHidden/>
+              </w:rPr>
+              <w:fldChar w:fldCharType="separate"/>
+            </w:r>
+            <w:r>
+              <w:rPr>
+                <w:noProof/>
+                <w:webHidden/>
+              </w:rPr>
+              <w:t>8</w:t>
+            </w:r>
+            <w:r>
+              <w:rPr>
+                <w:noProof/>
+                <w:webHidden/>
+              </w:rPr>
+              <w:fldChar w:fldCharType="end"/>
+            </w:r>
+          </w:hyperlink>
+        </w:p>
+        <w:p>
+          <w:pPr>
+            <w:pStyle w:val="TDC3"/>
+            <w:tabs>
+              <w:tab w:val="right" w:leader="dot" w:pos="8828"/>
+            </w:tabs>
+            <w:rPr>
+              <w:rFonts w:eastAsiaTheme="minorEastAsia"/>
+              <w:noProof/>
+              <w:lang w:eastAsia="es-CL"/>
+            </w:rPr>
+          </w:pPr>
+          <w:hyperlink w:anchor="_Toc243984726" w:history="1">
+            <w:r>
+              <w:rPr>
+                <w:rStyle w:val="Hipervnculo"/>
+                <w:b/>
+                <w:bCs/>
+                <w:noProof/>
+              </w:rPr>
+              <w:t>Revisar reserva</w:t>
+            </w:r>
+            <w:r>
+              <w:rPr>
+                <w:noProof/>
+                <w:webHidden/>
+              </w:rPr>
+              <w:tab/>
+            </w:r>
+            <w:r>
+              <w:rPr>
+                <w:noProof/>
+                <w:webHidden/>
+              </w:rPr>
+              <w:fldChar w:fldCharType="begin"/>
+            </w:r>
+            <w:r>
+              <w:rPr>
+                <w:noProof/>
+                <w:webHidden/>
+              </w:rPr>
+              <w:instrText xml:space="preserve"> PAGEREF _Toc243984726 \h </w:instrText>
+            </w:r>
+            <w:r>
+              <w:rPr>
+                <w:noProof/>
+                <w:webHidden/>
+              </w:rPr>
+            </w:r>
+            <w:r>
+              <w:rPr>
+                <w:noProof/>
+                <w:webHidden/>
+              </w:rPr>
+              <w:fldChar w:fldCharType="separate"/>
+            </w:r>
+            <w:r>
+              <w:rPr>
+                <w:noProof/>
+                <w:webHidden/>
+              </w:rPr>
+              <w:t>8</w:t>
             </w:r>
             <w:r>
               <w:rPr>
@@ -1241,7 +1462,7 @@
               <w:lang w:eastAsia="es-CL"/>
             </w:rPr>
           </w:pPr>
-          <w:hyperlink w:anchor="_Toc243292444" w:history="1">
+          <w:hyperlink w:anchor="_Toc243984727" w:history="1">
             <w:r>
               <w:rPr>
                 <w:rStyle w:val="Hipervnculo"/>
@@ -1249,7 +1470,7 @@
                 <w:bCs/>
                 <w:noProof/>
               </w:rPr>
-              <w:t>Stock de bodega</w:t>
+              <w:t>Stock en bodega</w:t>
             </w:r>
             <w:r>
               <w:rPr>
@@ -1270,7 +1491,7 @@
                 <w:noProof/>
                 <w:webHidden/>
               </w:rPr>
-              <w:instrText xml:space="preserve"> PAGEREF _Toc243292444 \h </w:instrText>
+              <w:instrText xml:space="preserve"> PAGEREF _Toc243984727 \h </w:instrText>
             </w:r>
             <w:r>
               <w:rPr>
@@ -1313,7 +1534,7 @@
               <w:lang w:eastAsia="es-CL"/>
             </w:rPr>
           </w:pPr>
-          <w:hyperlink w:anchor="_Toc243292445" w:history="1">
+          <w:hyperlink w:anchor="_Toc243984728" w:history="1">
             <w:r>
               <w:rPr>
                 <w:rStyle w:val="Hipervnculo"/>
@@ -1342,7 +1563,7 @@
                 <w:noProof/>
                 <w:webHidden/>
               </w:rPr>
-              <w:instrText xml:space="preserve"> PAGEREF _Toc243292445 \h </w:instrText>
+              <w:instrText xml:space="preserve"> PAGEREF _Toc243984728 \h </w:instrText>
             </w:r>
             <w:r>
               <w:rPr>
@@ -1385,7 +1606,7 @@
               <w:lang w:eastAsia="es-CL"/>
             </w:rPr>
           </w:pPr>
-          <w:hyperlink w:anchor="_Toc243292446" w:history="1">
+          <w:hyperlink w:anchor="_Toc243984729" w:history="1">
             <w:r>
               <w:rPr>
                 <w:rStyle w:val="Hipervnculo"/>
@@ -1393,7 +1614,7 @@
                 <w:bCs/>
                 <w:noProof/>
               </w:rPr>
-              <w:t>Planilla de inventario</w:t>
+              <w:t>Stock detallado</w:t>
             </w:r>
             <w:r>
               <w:rPr>
@@ -1414,7 +1635,7 @@
                 <w:noProof/>
                 <w:webHidden/>
               </w:rPr>
-              <w:instrText xml:space="preserve"> PAGEREF _Toc243292446 \h </w:instrText>
+              <w:instrText xml:space="preserve"> PAGEREF _Toc243984729 \h </w:instrText>
             </w:r>
             <w:r>
               <w:rPr>
@@ -1457,7 +1678,7 @@
               <w:lang w:eastAsia="es-CL"/>
             </w:rPr>
           </w:pPr>
-          <w:hyperlink w:anchor="_Toc243292447" w:history="1">
+          <w:hyperlink w:anchor="_Toc243984730" w:history="1">
             <w:r>
               <w:rPr>
                 <w:rStyle w:val="Hipervnculo"/>
@@ -1465,7 +1686,7 @@
                 <w:bCs/>
                 <w:noProof/>
               </w:rPr>
-              <w:t>Inventario por bodega</w:t>
+              <w:t>Planilla de inventario</w:t>
             </w:r>
             <w:r>
               <w:rPr>
@@ -1486,7 +1707,7 @@
                 <w:noProof/>
                 <w:webHidden/>
               </w:rPr>
-              <w:instrText xml:space="preserve"> PAGEREF _Toc243292447 \h </w:instrText>
+              <w:instrText xml:space="preserve"> PAGEREF _Toc243984730 \h </w:instrText>
             </w:r>
             <w:r>
               <w:rPr>
@@ -1506,7 +1727,7 @@
                 <w:noProof/>
                 <w:webHidden/>
               </w:rPr>
-              <w:t>8</w:t>
+              <w:t>9</w:t>
             </w:r>
             <w:r>
               <w:rPr>
@@ -1529,7 +1750,7 @@
               <w:lang w:eastAsia="es-CL"/>
             </w:rPr>
           </w:pPr>
-          <w:hyperlink w:anchor="_Toc243292448" w:history="1">
+          <w:hyperlink w:anchor="_Toc243984731" w:history="1">
             <w:r>
               <w:rPr>
                 <w:rStyle w:val="Hipervnculo"/>
@@ -1537,7 +1758,7 @@
                 <w:bCs/>
                 <w:noProof/>
               </w:rPr>
-              <w:t>Stock detallado</w:t>
+              <w:t>Movimientos</w:t>
             </w:r>
             <w:r>
               <w:rPr>
@@ -1558,7 +1779,7 @@
                 <w:noProof/>
                 <w:webHidden/>
               </w:rPr>
-              <w:instrText xml:space="preserve"> PAGEREF _Toc243292448 \h </w:instrText>
+              <w:instrText xml:space="preserve"> PAGEREF _Toc243984731 \h </w:instrText>
             </w:r>
             <w:r>
               <w:rPr>
@@ -1601,7 +1822,7 @@
               <w:lang w:eastAsia="es-CL"/>
             </w:rPr>
           </w:pPr>
-          <w:hyperlink w:anchor="_Toc243292449" w:history="1">
+          <w:hyperlink w:anchor="_Toc243984732" w:history="1">
             <w:r>
               <w:rPr>
                 <w:rStyle w:val="Hipervnculo"/>
@@ -1609,7 +1830,7 @@
                 <w:bCs/>
                 <w:noProof/>
               </w:rPr>
-              <w:t>Revisar stock de reserva</w:t>
+              <w:t>Bitácora de camiones</w:t>
             </w:r>
             <w:r>
               <w:rPr>
@@ -1630,7 +1851,7 @@
                 <w:noProof/>
                 <w:webHidden/>
               </w:rPr>
-              <w:instrText xml:space="preserve"> PAGEREF _Toc243292449 \h </w:instrText>
+              <w:instrText xml:space="preserve"> PAGEREF _Toc243984732 \h </w:instrText>
             </w:r>
             <w:r>
               <w:rPr>
@@ -1651,6 +1872,78 @@
                 <w:webHidden/>
               </w:rPr>
               <w:t>9</w:t>
+            </w:r>
+            <w:r>
+              <w:rPr>
+                <w:noProof/>
+                <w:webHidden/>
+              </w:rPr>
+              <w:fldChar w:fldCharType="end"/>
+            </w:r>
+          </w:hyperlink>
+        </w:p>
+        <w:p>
+          <w:pPr>
+            <w:pStyle w:val="TDC2"/>
+            <w:tabs>
+              <w:tab w:val="right" w:leader="dot" w:pos="8828"/>
+            </w:tabs>
+            <w:rPr>
+              <w:rFonts w:eastAsiaTheme="minorEastAsia"/>
+              <w:noProof/>
+              <w:lang w:eastAsia="es-CL"/>
+            </w:rPr>
+          </w:pPr>
+          <w:hyperlink w:anchor="_Toc243984733" w:history="1">
+            <w:r>
+              <w:rPr>
+                <w:rStyle w:val="Hipervnculo"/>
+                <w:b/>
+                <w:bCs/>
+                <w:noProof/>
+              </w:rPr>
+              <w:t>Planilla de ventas</w:t>
+            </w:r>
+            <w:r>
+              <w:rPr>
+                <w:noProof/>
+                <w:webHidden/>
+              </w:rPr>
+              <w:tab/>
+            </w:r>
+            <w:r>
+              <w:rPr>
+                <w:noProof/>
+                <w:webHidden/>
+              </w:rPr>
+              <w:fldChar w:fldCharType="begin"/>
+            </w:r>
+            <w:r>
+              <w:rPr>
+                <w:noProof/>
+                <w:webHidden/>
+              </w:rPr>
+              <w:instrText xml:space="preserve"> PAGEREF _Toc243984733 \h </w:instrText>
+            </w:r>
+            <w:r>
+              <w:rPr>
+                <w:noProof/>
+                <w:webHidden/>
+              </w:rPr>
+            </w:r>
+            <w:r>
+              <w:rPr>
+                <w:noProof/>
+                <w:webHidden/>
+              </w:rPr>
+              <w:fldChar w:fldCharType="separate"/>
+            </w:r>
+            <w:r>
+              <w:rPr>
+                <w:noProof/>
+                <w:webHidden/>
+              </w:rPr>
+              <w:t>10</w:t>
             </w:r>
             <w:r>
               <w:rPr>
@@ -1673,7 +1966,7 @@
               <w:lang w:eastAsia="es-CL"/>
             </w:rPr>
           </w:pPr>
-          <w:hyperlink w:anchor="_Toc243292450" w:history="1">
+          <w:hyperlink w:anchor="_Toc243984734" w:history="1">
             <w:r>
               <w:rPr>
                 <w:rStyle w:val="Hipervnculo"/>
@@ -1681,7 +1974,7 @@
                 <w:bCs/>
                 <w:noProof/>
               </w:rPr>
-              <w:t>Buscar reserva</w:t>
+              <w:t>Ventas</w:t>
             </w:r>
             <w:r>
               <w:rPr>
@@ -1702,7 +1995,7 @@
                 <w:noProof/>
                 <w:webHidden/>
               </w:rPr>
-              <w:instrText xml:space="preserve"> PAGEREF _Toc243292450 \h </w:instrText>
+              <w:instrText xml:space="preserve"> PAGEREF _Toc243984734 \h </w:instrText>
             </w:r>
             <w:r>
               <w:rPr>
@@ -1722,7 +2015,7 @@
                 <w:noProof/>
                 <w:webHidden/>
               </w:rPr>
-              <w:t>9</w:t>
+              <w:t>10</w:t>
             </w:r>
             <w:r>
               <w:rPr>
@@ -1745,7 +2038,7 @@
               <w:lang w:eastAsia="es-CL"/>
             </w:rPr>
           </w:pPr>
-          <w:hyperlink w:anchor="_Toc243292451" w:history="1">
+          <w:hyperlink w:anchor="_Toc243984735" w:history="1">
             <w:r>
               <w:rPr>
                 <w:rStyle w:val="Hipervnculo"/>
@@ -1753,7 +2046,7 @@
                 <w:bCs/>
                 <w:noProof/>
               </w:rPr>
-              <w:t>Revisar reserva</w:t>
+              <w:t>Traspaso</w:t>
             </w:r>
             <w:r>
               <w:rPr>
@@ -1774,7 +2067,7 @@
                 <w:noProof/>
                 <w:webHidden/>
               </w:rPr>
-              <w:instrText xml:space="preserve"> PAGEREF _Toc243292451 \h </w:instrText>
+              <w:instrText xml:space="preserve"> PAGEREF _Toc243984735 \h </w:instrText>
             </w:r>
             <w:r>
               <w:rPr>
@@ -1794,7 +2087,79 @@
                 <w:noProof/>
                 <w:webHidden/>
               </w:rPr>
-              <w:t>9</w:t>
+              <w:t>10</w:t>
+            </w:r>
+            <w:r>
+              <w:rPr>
+                <w:noProof/>
+                <w:webHidden/>
+              </w:rPr>
+              <w:fldChar w:fldCharType="end"/>
+            </w:r>
+          </w:hyperlink>
+        </w:p>
+        <w:p>
+          <w:pPr>
+            <w:pStyle w:val="TDC3"/>
+            <w:tabs>
+              <w:tab w:val="right" w:leader="dot" w:pos="8828"/>
+            </w:tabs>
+            <w:rPr>
+              <w:rFonts w:eastAsiaTheme="minorEastAsia"/>
+              <w:noProof/>
+              <w:lang w:eastAsia="es-CL"/>
+            </w:rPr>
+          </w:pPr>
+          <w:hyperlink w:anchor="_Toc243984736" w:history="1">
+            <w:r>
+              <w:rPr>
+                <w:rStyle w:val="Hipervnculo"/>
+                <w:b/>
+                <w:bCs/>
+                <w:noProof/>
+              </w:rPr>
+              <w:t>Tabla de previsualización</w:t>
+            </w:r>
+            <w:r>
+              <w:rPr>
+                <w:noProof/>
+                <w:webHidden/>
+              </w:rPr>
+              <w:tab/>
+            </w:r>
+            <w:r>
+              <w:rPr>
+                <w:noProof/>
+                <w:webHidden/>
+              </w:rPr>
+              <w:fldChar w:fldCharType="begin"/>
+            </w:r>
+            <w:r>
+              <w:rPr>
+                <w:noProof/>
+                <w:webHidden/>
+              </w:rPr>
+              <w:instrText xml:space="preserve"> PAGEREF _Toc243984736 \h </w:instrText>
+            </w:r>
+            <w:r>
+              <w:rPr>
+                <w:noProof/>
+                <w:webHidden/>
+              </w:rPr>
+            </w:r>
+            <w:r>
+              <w:rPr>
+                <w:noProof/>
+                <w:webHidden/>
+              </w:rPr>
+              <w:fldChar w:fldCharType="separate"/>
+            </w:r>
+            <w:r>
+              <w:rPr>
+                <w:noProof/>
+                <w:webHidden/>
+              </w:rPr>
+              <w:t>11</w:t>
             </w:r>
             <w:r>
               <w:rPr>
@@ -1817,7 +2182,7 @@
               <w:lang w:eastAsia="es-CL"/>
             </w:rPr>
           </w:pPr>
-          <w:hyperlink w:anchor="_Toc243292452" w:history="1">
+          <w:hyperlink w:anchor="_Toc243984737" w:history="1">
             <w:r>
               <w:rPr>
                 <w:rStyle w:val="Hipervnculo"/>
@@ -1825,7 +2190,7 @@
                 <w:bCs/>
                 <w:noProof/>
               </w:rPr>
-              <w:t>Planilla de ventas</w:t>
+              <w:t>Editar contratistas</w:t>
             </w:r>
             <w:r>
               <w:rPr>
@@ -1846,223 +2211,7 @@
                 <w:noProof/>
                 <w:webHidden/>
               </w:rPr>
-              <w:instrText xml:space="preserve"> PAGEREF _Toc243292452 \h </w:instrText>
-            </w:r>
-            <w:r>
-              <w:rPr>
-                <w:noProof/>
-                <w:webHidden/>
-              </w:rPr>
-            </w:r>
-            <w:r>
-              <w:rPr>
-                <w:noProof/>
-                <w:webHidden/>
-              </w:rPr>
-              <w:fldChar w:fldCharType="separate"/>
-            </w:r>
-            <w:r>
-              <w:rPr>
-                <w:noProof/>
-                <w:webHidden/>
-              </w:rPr>
-              <w:t>10</w:t>
-            </w:r>
-            <w:r>
-              <w:rPr>
-                <w:noProof/>
-                <w:webHidden/>
-              </w:rPr>
-              <w:fldChar w:fldCharType="end"/>
-            </w:r>
-          </w:hyperlink>
-        </w:p>
-        <w:p>
-          <w:pPr>
-            <w:pStyle w:val="TDC3"/>
-            <w:tabs>
-              <w:tab w:val="right" w:leader="dot" w:pos="8828"/>
-            </w:tabs>
-            <w:rPr>
-              <w:rFonts w:eastAsiaTheme="minorEastAsia"/>
-              <w:noProof/>
-              <w:lang w:eastAsia="es-CL"/>
-            </w:rPr>
-          </w:pPr>
-          <w:hyperlink w:anchor="_Toc243292453" w:history="1">
-            <w:r>
-              <w:rPr>
-                <w:rStyle w:val="Hipervnculo"/>
-                <w:b/>
-                <w:bCs/>
-                <w:noProof/>
-              </w:rPr>
-              <w:t>Ventas</w:t>
-            </w:r>
-            <w:r>
-              <w:rPr>
-                <w:noProof/>
-                <w:webHidden/>
-              </w:rPr>
-              <w:tab/>
-            </w:r>
-            <w:r>
-              <w:rPr>
-                <w:noProof/>
-                <w:webHidden/>
-              </w:rPr>
-              <w:fldChar w:fldCharType="begin"/>
-            </w:r>
-            <w:r>
-              <w:rPr>
-                <w:noProof/>
-                <w:webHidden/>
-              </w:rPr>
-              <w:instrText xml:space="preserve"> PAGEREF _Toc243292453 \h </w:instrText>
-            </w:r>
-            <w:r>
-              <w:rPr>
-                <w:noProof/>
-                <w:webHidden/>
-              </w:rPr>
-            </w:r>
-            <w:r>
-              <w:rPr>
-                <w:noProof/>
-                <w:webHidden/>
-              </w:rPr>
-              <w:fldChar w:fldCharType="separate"/>
-            </w:r>
-            <w:r>
-              <w:rPr>
-                <w:noProof/>
-                <w:webHidden/>
-              </w:rPr>
-              <w:t>10</w:t>
-            </w:r>
-            <w:r>
-              <w:rPr>
-                <w:noProof/>
-                <w:webHidden/>
-              </w:rPr>
-              <w:fldChar w:fldCharType="end"/>
-            </w:r>
-          </w:hyperlink>
-        </w:p>
-        <w:p>
-          <w:pPr>
-            <w:pStyle w:val="TDC3"/>
-            <w:tabs>
-              <w:tab w:val="right" w:leader="dot" w:pos="8828"/>
-            </w:tabs>
-            <w:rPr>
-              <w:rFonts w:eastAsiaTheme="minorEastAsia"/>
-              <w:noProof/>
-              <w:lang w:eastAsia="es-CL"/>
-            </w:rPr>
-          </w:pPr>
-          <w:hyperlink w:anchor="_Toc243292454" w:history="1">
-            <w:r>
-              <w:rPr>
-                <w:rStyle w:val="Hipervnculo"/>
-                <w:b/>
-                <w:bCs/>
-                <w:noProof/>
-              </w:rPr>
-              <w:t>Traspaso</w:t>
-            </w:r>
-            <w:r>
-              <w:rPr>
-                <w:noProof/>
-                <w:webHidden/>
-              </w:rPr>
-              <w:tab/>
-            </w:r>
-            <w:r>
-              <w:rPr>
-                <w:noProof/>
-                <w:webHidden/>
-              </w:rPr>
-              <w:fldChar w:fldCharType="begin"/>
-            </w:r>
-            <w:r>
-              <w:rPr>
-                <w:noProof/>
-                <w:webHidden/>
-              </w:rPr>
-              <w:instrText xml:space="preserve"> PAGEREF _Toc243292454 \h </w:instrText>
-            </w:r>
-            <w:r>
-              <w:rPr>
-                <w:noProof/>
-                <w:webHidden/>
-              </w:rPr>
-            </w:r>
-            <w:r>
-              <w:rPr>
-                <w:noProof/>
-                <w:webHidden/>
-              </w:rPr>
-              <w:fldChar w:fldCharType="separate"/>
-            </w:r>
-            <w:r>
-              <w:rPr>
-                <w:noProof/>
-                <w:webHidden/>
-              </w:rPr>
-              <w:t>10</w:t>
-            </w:r>
-            <w:r>
-              <w:rPr>
-                <w:noProof/>
-                <w:webHidden/>
-              </w:rPr>
-              <w:fldChar w:fldCharType="end"/>
-            </w:r>
-          </w:hyperlink>
-        </w:p>
-        <w:p>
-          <w:pPr>
-            <w:pStyle w:val="TDC2"/>
-            <w:tabs>
-              <w:tab w:val="right" w:leader="dot" w:pos="8828"/>
-            </w:tabs>
-            <w:rPr>
-              <w:rFonts w:eastAsiaTheme="minorEastAsia"/>
-              <w:noProof/>
-              <w:lang w:eastAsia="es-CL"/>
-            </w:rPr>
-          </w:pPr>
-          <w:hyperlink w:anchor="_Toc243292455" w:history="1">
-            <w:r>
-              <w:rPr>
-                <w:rStyle w:val="Hipervnculo"/>
-                <w:b/>
-                <w:bCs/>
-                <w:noProof/>
-              </w:rPr>
-              <w:t>Editar contratistas</w:t>
-            </w:r>
-            <w:r>
-              <w:rPr>
-                <w:noProof/>
-                <w:webHidden/>
-              </w:rPr>
-              <w:tab/>
-            </w:r>
-            <w:r>
-              <w:rPr>
-                <w:noProof/>
-                <w:webHidden/>
-              </w:rPr>
-              <w:fldChar w:fldCharType="begin"/>
-            </w:r>
-            <w:r>
-              <w:rPr>
-                <w:noProof/>
-                <w:webHidden/>
-              </w:rPr>
-              <w:instrText xml:space="preserve"> PAGEREF _Toc243292455 \h </w:instrText>
+              <w:instrText xml:space="preserve"> PAGEREF _Toc243984737 \h </w:instrText>
             </w:r>
             <w:r>
               <w:rPr>
@@ -2115,7 +2264,7 @@
           <w:color w:val="auto"/>
         </w:rPr>
       </w:pPr>
-      <w:bookmarkStart w:id="0" w:name="_Toc243292428"/>
+      <w:bookmarkStart w:id="0" w:name="_Toc243984708"/>
       <w:r>
         <w:rPr>
           <w:b/>
@@ -2148,7 +2297,7 @@
           <w:color w:val="auto"/>
         </w:rPr>
       </w:pPr>
-      <w:bookmarkStart w:id="1" w:name="_Toc243292429"/>
+      <w:bookmarkStart w:id="1" w:name="_Toc243984709"/>
       <w:r>
         <w:rPr>
           <w:b/>
@@ -2227,7 +2376,15 @@
         <w:t>límite</w:t>
       </w:r>
       <w:r>
-        <w:t xml:space="preserve"> de espacio permitido, que una ve se pase comenzara a exigir un pago para ampliarse, estar atento con lo que se suba para evitar llegar a ese límite de 500MB.</w:t>
+        <w:t xml:space="preserve"> de espacio permitido, que una </w:t>
+      </w:r>
+      <w:proofErr w:type="spellStart"/>
+      <w:r>
+        <w:t>ve</w:t>
+      </w:r>
+      <w:proofErr w:type="spellEnd"/>
+      <w:r>
+        <w:t xml:space="preserve"> se pase comenzara a exigir un pago para ampliarse, estar atento con lo que se suba para evitar llegar a ese límite de 500MB.</w:t>
       </w:r>
     </w:p>
     <w:p>
@@ -2256,14 +2413,13 @@
           <w:color w:val="auto"/>
         </w:rPr>
       </w:pPr>
-      <w:bookmarkStart w:id="2" w:name="_Toc243292430"/>
-      <w:r>
-        <w:rPr>
-          <w:b/>
-          <w:bCs/>
-          <w:color w:val="auto"/>
-        </w:rPr>
-        <w:lastRenderedPageBreak/>
+      <w:bookmarkStart w:id="2" w:name="_Toc243984710"/>
+      <w:r>
+        <w:rPr>
+          <w:b/>
+          <w:bCs/>
+          <w:color w:val="auto"/>
+        </w:rPr>
         <w:t>Inventario y tabla general</w:t>
       </w:r>
       <w:bookmarkEnd w:id="2"/>
@@ -2396,7 +2552,15 @@
     </w:p>
     <w:p>
       <w:r>
-        <w:t>La navbar (barra de navegación que está en la parte superior del programa)</w:t>
+        <w:t xml:space="preserve">La </w:t>
+      </w:r>
+      <w:proofErr w:type="spellStart"/>
+      <w:r>
+        <w:t>navbar</w:t>
+      </w:r>
+      <w:proofErr w:type="spellEnd"/>
+      <w:r>
+        <w:t xml:space="preserve"> (barra de navegación que está en la parte superior del programa)</w:t>
       </w:r>
       <w:r>
         <w:t xml:space="preserve"> tiene varias funciones:</w:t>
@@ -2483,7 +2647,23 @@
         </w:numPr>
       </w:pPr>
       <w:r>
-        <w:t>El botón admin llevara a la pantalla de admin.</w:t>
+        <w:t xml:space="preserve">El botón </w:t>
+      </w:r>
+      <w:proofErr w:type="spellStart"/>
+      <w:r>
+        <w:t>admin</w:t>
+      </w:r>
+      <w:proofErr w:type="spellEnd"/>
+      <w:r>
+        <w:t xml:space="preserve"> llevara a la pantalla de </w:t>
+      </w:r>
+      <w:proofErr w:type="spellStart"/>
+      <w:r>
+        <w:t>admin</w:t>
+      </w:r>
+      <w:proofErr w:type="spellEnd"/>
+      <w:r>
+        <w:t>.</w:t>
       </w:r>
     </w:p>
     <w:p>
@@ -2653,7 +2833,15 @@
     </w:p>
     <w:p>
       <w:r>
-        <w:t xml:space="preserve">El primer botón permite limpiar las columnas de inventario y comentario, para iniciar un nuevo periodo de inventario, realizar esta acción pedirá la contraseña de admin. El segundo botón permite descargar la planilla, se </w:t>
+        <w:t xml:space="preserve">El primer botón permite limpiar las columnas de inventario y comentario, para iniciar un nuevo periodo de inventario, realizar esta acción pedirá la contraseña de </w:t>
+      </w:r>
+      <w:proofErr w:type="spellStart"/>
+      <w:r>
+        <w:t>admin</w:t>
+      </w:r>
+      <w:proofErr w:type="spellEnd"/>
+      <w:r>
+        <w:t xml:space="preserve">. El segundo botón permite descargar la planilla, se </w:t>
       </w:r>
       <w:r>
         <w:t>descargará</w:t>
@@ -2671,7 +2859,7 @@
           <w:color w:val="auto"/>
         </w:rPr>
       </w:pPr>
-      <w:bookmarkStart w:id="3" w:name="_Toc243292431"/>
+      <w:bookmarkStart w:id="3" w:name="_Toc243984711"/>
       <w:r>
         <w:rPr>
           <w:b/>
@@ -2740,17 +2928,43 @@
     </w:p>
     <w:p>
       <w:r>
-        <w:t>Se puede modificar los datos del material si se usa la contraseña de admin.</w:t>
-      </w:r>
-    </w:p>
-    <w:p>
-      <w:r>
-        <w:t>La sección derecha esta diseñada para que se realice el inventario, digitando la cantidad que se cuenta y pudiendo dejar algún comentario, una vez enviado lo contado se mostrara automáticamente en la tabla principal.</w:t>
-      </w:r>
-    </w:p>
-    <w:p>
-      <w:r>
-        <w:t>El punto de color junto al titulo de la pagina es el color que tiene su celda en la tabla principal.</w:t>
+        <w:t xml:space="preserve">Se puede modificar los datos del material si se usa la contraseña de </w:t>
+      </w:r>
+      <w:proofErr w:type="spellStart"/>
+      <w:r>
+        <w:t>admin</w:t>
+      </w:r>
+      <w:proofErr w:type="spellEnd"/>
+      <w:r>
+        <w:t>.</w:t>
+      </w:r>
+    </w:p>
+    <w:p>
+      <w:r>
+        <w:t xml:space="preserve">La sección derecha </w:t>
+      </w:r>
+      <w:r>
+        <w:t>está</w:t>
+      </w:r>
+      <w:r>
+        <w:t xml:space="preserve"> diseñada para que se realice el inventario, digitando la cantidad que se cuenta y pudiendo dejar algún comentario, una vez enviado lo contado se mostrara automáticamente en la tabla principal.</w:t>
+      </w:r>
+    </w:p>
+    <w:p>
+      <w:r>
+        <w:t xml:space="preserve">El punto de color junto al </w:t>
+      </w:r>
+      <w:r>
+        <w:t>título</w:t>
+      </w:r>
+      <w:r>
+        <w:t xml:space="preserve"> de la </w:t>
+      </w:r>
+      <w:r>
+        <w:t>página</w:t>
+      </w:r>
+      <w:r>
+        <w:t xml:space="preserve"> es el color que tiene su celda en la tabla principal.</w:t>
       </w:r>
     </w:p>
     <w:p>
@@ -2762,7 +2976,8 @@
           <w:color w:val="auto"/>
         </w:rPr>
       </w:pPr>
-      <w:bookmarkStart w:id="4" w:name="_Toc243292432"/>
+      <w:bookmarkStart w:id="4" w:name="_Toc243984712"/>
+      <w:proofErr w:type="spellStart"/>
       <w:r>
         <w:rPr>
           <w:b/>
@@ -2772,6 +2987,7 @@
         <w:t>Admin</w:t>
       </w:r>
       <w:bookmarkEnd w:id="4"/>
+      <w:proofErr w:type="spellEnd"/>
     </w:p>
     <w:p>
       <w:pPr>
@@ -2820,7 +3036,15 @@
     </w:p>
     <w:p>
       <w:r>
-        <w:t>Para entrar a esta sección se necesita de digitar la contraseña de admin, una vez se permita el acceso aparecerán botones (los cuales se pueden agrandar) que permitirán realizar las siguientes acciones.</w:t>
+        <w:t xml:space="preserve">Para entrar a esta sección se necesita de digitar la contraseña de </w:t>
+      </w:r>
+      <w:proofErr w:type="spellStart"/>
+      <w:r>
+        <w:t>admin</w:t>
+      </w:r>
+      <w:proofErr w:type="spellEnd"/>
+      <w:r>
+        <w:t>, una vez se permita el acceso aparecerán botones (los cuales se pueden agrandar) que permitirán realizar las siguientes acciones.</w:t>
       </w:r>
     </w:p>
     <w:p>
@@ -2832,7 +3056,7 @@
           <w:color w:val="auto"/>
         </w:rPr>
       </w:pPr>
-      <w:bookmarkStart w:id="5" w:name="_Toc243292433"/>
+      <w:bookmarkStart w:id="5" w:name="_Toc243984713"/>
       <w:r>
         <w:rPr>
           <w:b/>
@@ -2898,12 +3122,24 @@
     </w:p>
     <w:p>
       <w:r>
-        <w:t>Mientras se importan datos se bloquearán funciones de la pagina para evitar errores de subida.</w:t>
-      </w:r>
-    </w:p>
-    <w:p>
-      <w:r>
-        <w:t>Se indica cuando fue la ultima vez que se cargaron materiales de cada sección.</w:t>
+        <w:t xml:space="preserve">Mientras se importan datos se bloquearán funciones de la </w:t>
+      </w:r>
+      <w:r>
+        <w:t>página</w:t>
+      </w:r>
+      <w:r>
+        <w:t xml:space="preserve"> para evitar errores de subida.</w:t>
+      </w:r>
+    </w:p>
+    <w:p>
+      <w:r>
+        <w:t xml:space="preserve">Se indica cuando fue la </w:t>
+      </w:r>
+      <w:r>
+        <w:t>última</w:t>
+      </w:r>
+      <w:r>
+        <w:t xml:space="preserve"> vez que se cargaron materiales de cada sección.</w:t>
       </w:r>
     </w:p>
     <w:p>
@@ -2915,7 +3151,7 @@
           <w:color w:val="auto"/>
         </w:rPr>
       </w:pPr>
-      <w:bookmarkStart w:id="6" w:name="_Toc243292434"/>
+      <w:bookmarkStart w:id="6" w:name="_Toc243984714"/>
       <w:r>
         <w:rPr>
           <w:b/>
@@ -2940,7 +3176,7 @@
           <w:color w:val="auto"/>
         </w:rPr>
       </w:pPr>
-      <w:bookmarkStart w:id="7" w:name="_Toc243292435"/>
+      <w:bookmarkStart w:id="7" w:name="_Toc243984715"/>
       <w:r>
         <w:rPr>
           <w:b/>
@@ -2965,7 +3201,7 @@
           <w:color w:val="auto"/>
         </w:rPr>
       </w:pPr>
-      <w:bookmarkStart w:id="8" w:name="_Toc243292436"/>
+      <w:bookmarkStart w:id="8" w:name="_Toc243984716"/>
       <w:r>
         <w:rPr>
           <w:b/>
@@ -2978,7 +3214,15 @@
     </w:p>
     <w:p>
       <w:r>
-        <w:t>Planilla de ubicaciones oficial, la filtrara para tomar en cuenta solo la bodega M501, añadiéndole una ubicación y sub-ubicación a cada código encontrado.</w:t>
+        <w:t xml:space="preserve">Planilla de ubicaciones oficial, la filtrara para tomar en cuenta solo la bodega M501, añadiéndole una ubicación y </w:t>
+      </w:r>
+      <w:proofErr w:type="spellStart"/>
+      <w:r>
+        <w:t>sub-ubicación</w:t>
+      </w:r>
+      <w:proofErr w:type="spellEnd"/>
+      <w:r>
+        <w:t xml:space="preserve"> a cada código encontrado.</w:t>
       </w:r>
     </w:p>
     <w:p>
@@ -2990,7 +3234,7 @@
           <w:color w:val="auto"/>
         </w:rPr>
       </w:pPr>
-      <w:bookmarkStart w:id="9" w:name="_Toc243292437"/>
+      <w:bookmarkStart w:id="9" w:name="_Toc243984717"/>
       <w:r>
         <w:rPr>
           <w:b/>
@@ -3015,7 +3259,7 @@
           <w:color w:val="auto"/>
         </w:rPr>
       </w:pPr>
-      <w:bookmarkStart w:id="10" w:name="_Toc243292438"/>
+      <w:bookmarkStart w:id="10" w:name="_Toc243984718"/>
       <w:r>
         <w:rPr>
           <w:b/>
@@ -3040,7 +3284,7 @@
           <w:color w:val="auto"/>
         </w:rPr>
       </w:pPr>
-      <w:bookmarkStart w:id="11" w:name="_Toc243292439"/>
+      <w:bookmarkStart w:id="11" w:name="_Toc243984719"/>
       <w:r>
         <w:rPr>
           <w:b/>
@@ -3065,6 +3309,7 @@
           <w:color w:val="auto"/>
         </w:rPr>
       </w:pPr>
+      <w:bookmarkStart w:id="12" w:name="_Toc243984720"/>
       <w:r>
         <w:rPr>
           <w:b/>
@@ -3073,10 +3318,17 @@
         </w:rPr>
         <w:t>Movimientos</w:t>
       </w:r>
-    </w:p>
-    <w:p>
-      <w:r>
-        <w:t>En esta sección se carga una planilla de solo una columna los códigos de los materiales que han tenido movimiento recientemente. Cada vez que se carga esta sección, los datos reemplazan los datos cargados enterioremente.</w:t>
+      <w:bookmarkEnd w:id="12"/>
+    </w:p>
+    <w:p>
+      <w:r>
+        <w:t xml:space="preserve">En esta sección se carga una planilla de solo una columna los códigos de los materiales que han tenido movimiento recientemente. Cada vez que se carga esta sección, los datos reemplazan los datos cargados </w:t>
+      </w:r>
+      <w:r>
+        <w:t>anteriormente</w:t>
+      </w:r>
+      <w:r>
+        <w:t>.</w:t>
       </w:r>
     </w:p>
     <w:p>
@@ -3088,7 +3340,7 @@
           <w:color w:val="auto"/>
         </w:rPr>
       </w:pPr>
-      <w:bookmarkStart w:id="12" w:name="_Toc243292440"/>
+      <w:bookmarkStart w:id="13" w:name="_Toc243984721"/>
       <w:r>
         <w:rPr>
           <w:b/>
@@ -3098,17 +3350,33 @@
         <w:lastRenderedPageBreak/>
         <w:t>Cargar QR</w:t>
       </w:r>
-      <w:bookmarkEnd w:id="12"/>
+      <w:bookmarkEnd w:id="13"/>
     </w:p>
     <w:p>
       <w:r>
         <w:t xml:space="preserve">Carga imágenes .png </w:t>
       </w:r>
       <w:r>
-        <w:t xml:space="preserve">o .jpg </w:t>
-      </w:r>
-      <w:r>
-        <w:t>de los códigos QR de los materiales, se debe seleccionar una carpeta con archivos y solo subirá aquellos que tengan un peso menor a 100KB y tengan este formato de nombre “qr_codigo de material”</w:t>
+        <w:t>o .</w:t>
+      </w:r>
+      <w:proofErr w:type="spellStart"/>
+      <w:r>
+        <w:t>jpg</w:t>
+      </w:r>
+      <w:proofErr w:type="spellEnd"/>
+      <w:r>
+        <w:t xml:space="preserve"> </w:t>
+      </w:r>
+      <w:r>
+        <w:t>de los códigos QR de los materiales, se debe seleccionar una carpeta con archivos y solo subirá aquellos que tengan un peso menor a 100KB y tengan este formato de nombre “</w:t>
+      </w:r>
+      <w:proofErr w:type="spellStart"/>
+      <w:r>
+        <w:t>qr_codigo</w:t>
+      </w:r>
+      <w:proofErr w:type="spellEnd"/>
+      <w:r>
+        <w:t xml:space="preserve"> de material”</w:t>
       </w:r>
       <w:r>
         <w:t xml:space="preserve"> con alguna de las extensiones indicadas</w:t>
@@ -3131,7 +3399,7 @@
           <w:color w:val="auto"/>
         </w:rPr>
       </w:pPr>
-      <w:bookmarkStart w:id="13" w:name="_Toc243292441"/>
+      <w:bookmarkStart w:id="14" w:name="_Toc243984722"/>
       <w:r>
         <w:rPr>
           <w:b/>
@@ -3140,17 +3408,22 @@
         </w:rPr>
         <w:t>Cargar rombo</w:t>
       </w:r>
-      <w:bookmarkEnd w:id="13"/>
+      <w:bookmarkEnd w:id="14"/>
     </w:p>
     <w:p>
       <w:r>
         <w:t>Carga imágenes .png de los rombos de los materiales, se debe seleccionar una carpeta con archivos y solo subirá aquellos que tengan un peso menor a 100KB y tengan este formato de nombre “</w:t>
       </w:r>
+      <w:proofErr w:type="spellStart"/>
       <w:r>
         <w:t>rombo</w:t>
       </w:r>
       <w:r>
-        <w:t xml:space="preserve">_codigo de material”, </w:t>
+        <w:t>_codigo</w:t>
+      </w:r>
+      <w:proofErr w:type="spellEnd"/>
+      <w:r>
+        <w:t xml:space="preserve"> de material”, </w:t>
       </w:r>
       <w:r>
         <w:t xml:space="preserve">con algunas de las extensiones </w:t>
@@ -3176,7 +3449,7 @@
           <w:color w:val="auto"/>
         </w:rPr>
       </w:pPr>
-      <w:bookmarkStart w:id="14" w:name="_Toc243292442"/>
+      <w:bookmarkStart w:id="15" w:name="_Toc243984723"/>
       <w:r>
         <w:rPr>
           <w:b/>
@@ -3185,11 +3458,19 @@
         </w:rPr>
         <w:t>Cargar fotos</w:t>
       </w:r>
-      <w:bookmarkEnd w:id="14"/>
-    </w:p>
-    <w:p>
-      <w:r>
-        <w:t xml:space="preserve">Carga imágenes .png de los rombos de los materiales, se debe seleccionar una carpeta con archivos y solo subirá aquellos que tengan un peso menor a 100KB y tengan este formato de nombre “foto_codigo de material”, con algunas de las extensiones </w:t>
+      <w:bookmarkEnd w:id="15"/>
+    </w:p>
+    <w:p>
+      <w:r>
+        <w:t>Carga imágenes .png de los rombos de los materiales, se debe seleccionar una carpeta con archivos y solo subirá aquellos que tengan un peso menor a 100KB y tengan este formato de nombre “</w:t>
+      </w:r>
+      <w:proofErr w:type="spellStart"/>
+      <w:r>
+        <w:t>foto_codigo</w:t>
+      </w:r>
+      <w:proofErr w:type="spellEnd"/>
+      <w:r>
+        <w:t xml:space="preserve"> de material”, con algunas de las extensiones </w:t>
       </w:r>
       <w:r>
         <w:t>indicadas, rescatando</w:t>
@@ -3212,7 +3493,7 @@
           <w:color w:val="auto"/>
         </w:rPr>
       </w:pPr>
-      <w:bookmarkStart w:id="15" w:name="_Toc243292449"/>
+      <w:bookmarkStart w:id="16" w:name="_Toc243984724"/>
       <w:r>
         <w:rPr>
           <w:b/>
@@ -3221,7 +3502,7 @@
         </w:rPr>
         <w:t>Revisar stock de reserva</w:t>
       </w:r>
-      <w:bookmarkEnd w:id="15"/>
+      <w:bookmarkEnd w:id="16"/>
     </w:p>
     <w:p>
       <w:r>
@@ -3279,7 +3560,7 @@
           <w:color w:val="auto"/>
         </w:rPr>
       </w:pPr>
-      <w:bookmarkStart w:id="16" w:name="_Toc243292450"/>
+      <w:bookmarkStart w:id="17" w:name="_Toc243984725"/>
       <w:r>
         <w:rPr>
           <w:b/>
@@ -3289,7 +3570,7 @@
         <w:lastRenderedPageBreak/>
         <w:t>Buscar reserva</w:t>
       </w:r>
-      <w:bookmarkEnd w:id="16"/>
+      <w:bookmarkEnd w:id="17"/>
     </w:p>
     <w:p>
       <w:r>
@@ -3305,7 +3586,7 @@
           <w:color w:val="auto"/>
         </w:rPr>
       </w:pPr>
-      <w:bookmarkStart w:id="17" w:name="_Toc243292451"/>
+      <w:bookmarkStart w:id="18" w:name="_Toc243984726"/>
       <w:r>
         <w:rPr>
           <w:b/>
@@ -3314,7 +3595,7 @@
         </w:rPr>
         <w:t>Revisar reserva</w:t>
       </w:r>
-      <w:bookmarkEnd w:id="17"/>
+      <w:bookmarkEnd w:id="18"/>
     </w:p>
     <w:p>
       <w:r>
@@ -3330,7 +3611,7 @@
           <w:color w:val="auto"/>
         </w:rPr>
       </w:pPr>
-      <w:bookmarkStart w:id="18" w:name="_Toc243292444"/>
+      <w:bookmarkStart w:id="19" w:name="_Toc243984727"/>
       <w:r>
         <w:rPr>
           <w:b/>
@@ -3355,7 +3636,7 @@
         </w:rPr>
         <w:t xml:space="preserve"> bodega</w:t>
       </w:r>
-      <w:bookmarkEnd w:id="18"/>
+      <w:bookmarkEnd w:id="19"/>
     </w:p>
     <w:p>
       <w:r>
@@ -3416,7 +3697,7 @@
           <w:color w:val="auto"/>
         </w:rPr>
       </w:pPr>
-      <w:bookmarkStart w:id="19" w:name="_Toc243292445"/>
+      <w:bookmarkStart w:id="20" w:name="_Toc243984728"/>
       <w:r>
         <w:rPr>
           <w:b/>
@@ -3425,7 +3706,7 @@
         </w:rPr>
         <w:t>Stock regional</w:t>
       </w:r>
-      <w:bookmarkEnd w:id="19"/>
+      <w:bookmarkEnd w:id="20"/>
     </w:p>
     <w:p>
       <w:r>
@@ -3480,10 +3761,7 @@
         <w:t xml:space="preserve"> stock de todas las bodegas y la totalidad del stock entre las bodegas de la región.</w:t>
       </w:r>
       <w:r>
-        <w:t xml:space="preserve"> </w:t>
-      </w:r>
-      <w:r>
-        <w:t>A esta sección se le pueden aplicar los mismos filtros que a la tabla principal.</w:t>
+        <w:t xml:space="preserve"> A esta sección se le pueden aplicar los mismos filtros que a la tabla principal.</w:t>
       </w:r>
     </w:p>
     <w:p>
@@ -3495,7 +3773,7 @@
           <w:color w:val="auto"/>
         </w:rPr>
       </w:pPr>
-      <w:bookmarkStart w:id="20" w:name="_Toc243292448"/>
+      <w:bookmarkStart w:id="21" w:name="_Toc243984729"/>
       <w:r>
         <w:rPr>
           <w:b/>
@@ -3504,7 +3782,7 @@
         </w:rPr>
         <w:t>Stock detallado</w:t>
       </w:r>
-      <w:bookmarkEnd w:id="20"/>
+      <w:bookmarkEnd w:id="21"/>
     </w:p>
     <w:p>
       <w:r>
@@ -3553,10 +3831,7 @@
         <w:t>Se genera una planilla descargable que muestra los datos principales de los materiales, hecho en base a planilla usada actualmente.</w:t>
       </w:r>
       <w:r>
-        <w:t xml:space="preserve"> </w:t>
-      </w:r>
-      <w:r>
-        <w:t>A esta sección se le pueden aplicar los mismos filtros que a la tabla principal.</w:t>
+        <w:t xml:space="preserve"> A esta sección se le pueden aplicar los mismos filtros que a la tabla principal.</w:t>
       </w:r>
     </w:p>
     <w:p>
@@ -3568,7 +3843,7 @@
           <w:color w:val="auto"/>
         </w:rPr>
       </w:pPr>
-      <w:bookmarkStart w:id="21" w:name="_Toc243292446"/>
+      <w:bookmarkStart w:id="22" w:name="_Toc243984730"/>
       <w:r>
         <w:rPr>
           <w:b/>
@@ -3578,7 +3853,7 @@
         <w:lastRenderedPageBreak/>
         <w:t>Planilla de inventario</w:t>
       </w:r>
-      <w:bookmarkEnd w:id="21"/>
+      <w:bookmarkEnd w:id="22"/>
     </w:p>
     <w:p>
       <w:r>
@@ -3627,10 +3902,7 @@
         <w:t>Se genera una planilla descargable para realizar inventario físico en la bodega M501, permite traspasar datos de las columnas de stock reales o de inventario para que se auto rellene la planilla.</w:t>
       </w:r>
       <w:r>
-        <w:t xml:space="preserve"> </w:t>
-      </w:r>
-      <w:r>
-        <w:t>A esta sección se le pueden aplicar los mismos filtros que a la tabla principal.</w:t>
+        <w:t xml:space="preserve"> A esta sección se le pueden aplicar los mismos filtros que a la tabla principal.</w:t>
       </w:r>
     </w:p>
     <w:p>
@@ -3642,6 +3914,7 @@
           <w:color w:val="auto"/>
         </w:rPr>
       </w:pPr>
+      <w:bookmarkStart w:id="23" w:name="_Toc243984731"/>
       <w:r>
         <w:rPr>
           <w:b/>
@@ -3650,9 +3923,13 @@
         </w:rPr>
         <w:t>Movimientos</w:t>
       </w:r>
-    </w:p>
-    <w:p>
-      <w:r>
+      <w:bookmarkEnd w:id="23"/>
+    </w:p>
+    <w:p>
+      <w:r>
+        <w:rPr>
+          <w:noProof/>
+        </w:rPr>
         <w:drawing>
           <wp:inline distT="0" distB="0" distL="0" distR="0" wp14:anchorId="62B6A063" wp14:editId="25C94E86">
             <wp:extent cx="5612130" cy="842645"/>
@@ -3713,7 +3990,7 @@
           <w:color w:val="auto"/>
         </w:rPr>
       </w:pPr>
-      <w:bookmarkStart w:id="22" w:name="_Toc243292443"/>
+      <w:bookmarkStart w:id="24" w:name="_Toc243984732"/>
       <w:r>
         <w:rPr>
           <w:b/>
@@ -3722,7 +3999,7 @@
         </w:rPr>
         <w:t>Bitácora de camiones</w:t>
       </w:r>
-      <w:bookmarkEnd w:id="22"/>
+      <w:bookmarkEnd w:id="24"/>
     </w:p>
     <w:p>
       <w:r>
@@ -3768,7 +4045,15 @@
     </w:p>
     <w:p>
       <w:r>
-        <w:t>Se puede generar y buscar planillas de bitácora para los camiones, permite subir una firma digital, cada cambio puede ser visible por un admin en una sección especial.</w:t>
+        <w:t xml:space="preserve">Se puede generar y buscar planillas de bitácora para los camiones, permite subir una firma digital, cada cambio puede ser visible por un </w:t>
+      </w:r>
+      <w:proofErr w:type="spellStart"/>
+      <w:r>
+        <w:t>admin</w:t>
+      </w:r>
+      <w:proofErr w:type="spellEnd"/>
+      <w:r>
+        <w:t xml:space="preserve"> en una sección especial.</w:t>
       </w:r>
     </w:p>
     <w:p>
@@ -3780,7 +4065,7 @@
           <w:color w:val="auto"/>
         </w:rPr>
       </w:pPr>
-      <w:bookmarkStart w:id="23" w:name="_Toc243292452"/>
+      <w:bookmarkStart w:id="25" w:name="_Toc243984733"/>
       <w:r>
         <w:rPr>
           <w:b/>
@@ -3790,7 +4075,7 @@
         <w:lastRenderedPageBreak/>
         <w:t>Planilla de ventas</w:t>
       </w:r>
-      <w:bookmarkEnd w:id="23"/>
+      <w:bookmarkEnd w:id="25"/>
     </w:p>
     <w:p>
       <w:r>
@@ -3861,7 +4146,7 @@
           <w:color w:val="auto"/>
         </w:rPr>
       </w:pPr>
-      <w:bookmarkStart w:id="24" w:name="_Toc243292453"/>
+      <w:bookmarkStart w:id="26" w:name="_Toc243984734"/>
       <w:r>
         <w:rPr>
           <w:b/>
@@ -3870,7 +4155,7 @@
         </w:rPr>
         <w:t>Ventas</w:t>
       </w:r>
-      <w:bookmarkEnd w:id="24"/>
+      <w:bookmarkEnd w:id="26"/>
     </w:p>
     <w:p>
       <w:r>
@@ -3892,7 +4177,7 @@
           <w:color w:val="auto"/>
         </w:rPr>
       </w:pPr>
-      <w:bookmarkStart w:id="25" w:name="_Toc243292454"/>
+      <w:bookmarkStart w:id="27" w:name="_Toc243984735"/>
       <w:r>
         <w:rPr>
           <w:b/>
@@ -3901,7 +4186,7 @@
         </w:rPr>
         <w:t>Traspaso</w:t>
       </w:r>
-      <w:bookmarkEnd w:id="25"/>
+      <w:bookmarkEnd w:id="27"/>
     </w:p>
     <w:p>
       <w:r>
@@ -3919,6 +4204,7 @@
           <w:color w:val="auto"/>
         </w:rPr>
       </w:pPr>
+      <w:bookmarkStart w:id="28" w:name="_Toc243984736"/>
       <w:r>
         <w:rPr>
           <w:b/>
@@ -3927,6 +4213,7 @@
         </w:rPr>
         <w:t>Tabla de previsualización</w:t>
       </w:r>
+      <w:bookmarkEnd w:id="28"/>
     </w:p>
     <w:p>
       <w:r>
@@ -3982,7 +4269,15 @@
     </w:p>
     <w:p>
       <w:r>
-        <w:t>Por ultimo se permite descargar la planilla mensual y de meses pasados o una planilla del año completo</w:t>
+        <w:t xml:space="preserve">Por </w:t>
+      </w:r>
+      <w:proofErr w:type="spellStart"/>
+      <w:r>
+        <w:t>ultimo</w:t>
+      </w:r>
+      <w:proofErr w:type="spellEnd"/>
+      <w:r>
+        <w:t xml:space="preserve"> se permite descargar la planilla mensual y de meses pasados o una planilla del año completo</w:t>
       </w:r>
       <w:r>
         <w:t xml:space="preserve"> en su versión completa o para generar una planilla de para reservar esos materiales</w:t>
@@ -4000,7 +4295,7 @@
           <w:color w:val="auto"/>
         </w:rPr>
       </w:pPr>
-      <w:bookmarkStart w:id="26" w:name="_Toc243292455"/>
+      <w:bookmarkStart w:id="29" w:name="_Toc243984737"/>
       <w:r>
         <w:rPr>
           <w:b/>
@@ -4009,7 +4304,7 @@
         </w:rPr>
         <w:t>Editar contratistas</w:t>
       </w:r>
-      <w:bookmarkEnd w:id="26"/>
+      <w:bookmarkEnd w:id="29"/>
     </w:p>
     <w:p>
       <w:r>

</xml_diff>